<commit_message>
Responsive de la página presav, faltando el historial en construcción Mishidk
</commit_message>
<xml_diff>
--- a/public/plantilla_resolucion.docx
+++ b/public/plantilla_resolucion.docx
@@ -41,7 +41,67 @@
           <w:sz w:val="24"/>
           <w:szCs w:val="24"/>
         </w:rPr>
-        <w:t>RESOLUCIÓN {tipo_resolucion} CAPRESAV Nº{anio}/{correlativo}</w:t>
+        <w:t>RESOLUCIÓN {</w:t>
+      </w:r>
+      <w:proofErr w:type="spellStart"/>
+      <w:r>
+        <w:rPr>
+          <w:rFonts w:eastAsia="Times New Roman" w:cs="Times New Roman"/>
+          <w:b/>
+          <w:sz w:val="24"/>
+          <w:szCs w:val="24"/>
+        </w:rPr>
+        <w:t>tipo_resolucion</w:t>
+      </w:r>
+      <w:proofErr w:type="spellEnd"/>
+      <w:r>
+        <w:rPr>
+          <w:rFonts w:eastAsia="Times New Roman" w:cs="Times New Roman"/>
+          <w:b/>
+          <w:sz w:val="24"/>
+          <w:szCs w:val="24"/>
+        </w:rPr>
+        <w:t xml:space="preserve">} CAPRESAV </w:t>
+      </w:r>
+      <w:proofErr w:type="spellStart"/>
+      <w:r>
+        <w:rPr>
+          <w:rFonts w:eastAsia="Times New Roman" w:cs="Times New Roman"/>
+          <w:b/>
+          <w:sz w:val="24"/>
+          <w:szCs w:val="24"/>
+        </w:rPr>
+        <w:t>Nº</w:t>
+      </w:r>
+      <w:proofErr w:type="spellEnd"/>
+      <w:r>
+        <w:rPr>
+          <w:rFonts w:eastAsia="Times New Roman" w:cs="Times New Roman"/>
+          <w:b/>
+          <w:sz w:val="24"/>
+          <w:szCs w:val="24"/>
+        </w:rPr>
+        <w:t>{</w:t>
+      </w:r>
+      <w:proofErr w:type="spellStart"/>
+      <w:r>
+        <w:rPr>
+          <w:rFonts w:eastAsia="Times New Roman" w:cs="Times New Roman"/>
+          <w:b/>
+          <w:sz w:val="24"/>
+          <w:szCs w:val="24"/>
+        </w:rPr>
+        <w:t>anio</w:t>
+      </w:r>
+      <w:proofErr w:type="spellEnd"/>
+      <w:r>
+        <w:rPr>
+          <w:rFonts w:eastAsia="Times New Roman" w:cs="Times New Roman"/>
+          <w:b/>
+          <w:sz w:val="24"/>
+          <w:szCs w:val="24"/>
+        </w:rPr>
+        <w:t>}/{correlativo}</w:t>
       </w:r>
     </w:p>
     <w:p>
@@ -68,7 +128,25 @@
           <w:sz w:val="24"/>
           <w:szCs w:val="24"/>
         </w:rPr>
-        <w:t>{unidad_ejecutora}</w:t>
+        <w:t>{</w:t>
+      </w:r>
+      <w:proofErr w:type="spellStart"/>
+      <w:r>
+        <w:rPr>
+          <w:rFonts w:eastAsia="Times New Roman" w:cs="Times New Roman"/>
+          <w:sz w:val="24"/>
+          <w:szCs w:val="24"/>
+        </w:rPr>
+        <w:t>unidad_ejecutora</w:t>
+      </w:r>
+      <w:proofErr w:type="spellEnd"/>
+      <w:r>
+        <w:rPr>
+          <w:rFonts w:eastAsia="Times New Roman" w:cs="Times New Roman"/>
+          <w:sz w:val="24"/>
+          <w:szCs w:val="24"/>
+        </w:rPr>
+        <w:t>}</w:t>
       </w:r>
     </w:p>
     <w:p>
@@ -118,7 +196,67 @@
           <w:sz w:val="24"/>
           <w:szCs w:val="24"/>
         </w:rPr>
-        <w:t>FECHA: {fecha}        ACTA Nº: {acta} {tipo_resolucion}        PUNTO: {punto}</w:t>
+        <w:t>FECHA: {</w:t>
+      </w:r>
+      <w:proofErr w:type="gramStart"/>
+      <w:r>
+        <w:rPr>
+          <w:rFonts w:eastAsia="Times New Roman" w:cs="Times New Roman"/>
+          <w:b/>
+          <w:sz w:val="24"/>
+          <w:szCs w:val="24"/>
+        </w:rPr>
+        <w:t xml:space="preserve">fecha}   </w:t>
+      </w:r>
+      <w:proofErr w:type="gramEnd"/>
+      <w:r>
+        <w:rPr>
+          <w:rFonts w:eastAsia="Times New Roman" w:cs="Times New Roman"/>
+          <w:b/>
+          <w:sz w:val="24"/>
+          <w:szCs w:val="24"/>
+        </w:rPr>
+        <w:t xml:space="preserve">     ACTA </w:t>
+      </w:r>
+      <w:proofErr w:type="spellStart"/>
+      <w:r>
+        <w:rPr>
+          <w:rFonts w:eastAsia="Times New Roman" w:cs="Times New Roman"/>
+          <w:b/>
+          <w:sz w:val="24"/>
+          <w:szCs w:val="24"/>
+        </w:rPr>
+        <w:t>Nº</w:t>
+      </w:r>
+      <w:proofErr w:type="spellEnd"/>
+      <w:r>
+        <w:rPr>
+          <w:rFonts w:eastAsia="Times New Roman" w:cs="Times New Roman"/>
+          <w:b/>
+          <w:sz w:val="24"/>
+          <w:szCs w:val="24"/>
+        </w:rPr>
+        <w:t>: {acta} {</w:t>
+      </w:r>
+      <w:proofErr w:type="spellStart"/>
+      <w:r>
+        <w:rPr>
+          <w:rFonts w:eastAsia="Times New Roman" w:cs="Times New Roman"/>
+          <w:b/>
+          <w:sz w:val="24"/>
+          <w:szCs w:val="24"/>
+        </w:rPr>
+        <w:t>tipo_resolucion</w:t>
+      </w:r>
+      <w:proofErr w:type="spellEnd"/>
+      <w:r>
+        <w:rPr>
+          <w:rFonts w:eastAsia="Times New Roman" w:cs="Times New Roman"/>
+          <w:b/>
+          <w:sz w:val="24"/>
+          <w:szCs w:val="24"/>
+        </w:rPr>
+        <w:t>}        PUNTO: {punto}</w:t>
       </w:r>
     </w:p>
     <w:p>
@@ -276,7 +414,25 @@
           <w:sz w:val="24"/>
           <w:szCs w:val="24"/>
         </w:rPr>
-        <w:t>{texto_resolucion}</w:t>
+        <w:t>{</w:t>
+      </w:r>
+      <w:proofErr w:type="spellStart"/>
+      <w:r>
+        <w:rPr>
+          <w:rFonts w:eastAsia="Times New Roman" w:cs="Times New Roman"/>
+          <w:sz w:val="24"/>
+          <w:szCs w:val="24"/>
+        </w:rPr>
+        <w:t>texto_resolucion</w:t>
+      </w:r>
+      <w:proofErr w:type="spellEnd"/>
+      <w:r>
+        <w:rPr>
+          <w:rFonts w:eastAsia="Times New Roman" w:cs="Times New Roman"/>
+          <w:sz w:val="24"/>
+          <w:szCs w:val="24"/>
+        </w:rPr>
+        <w:t>}</w:t>
       </w:r>
     </w:p>
     <w:p>
@@ -612,7 +768,27 @@
         <w:sz w:val="24"/>
         <w:szCs w:val="24"/>
       </w:rPr>
+      <w:t>“</w:t>
+    </w:r>
+    <w:r>
+      <w:rPr>
+        <w:rFonts w:eastAsia="Times New Roman" w:cs="Times New Roman"/>
+        <w:b/>
+        <w:color w:val="C80000"/>
+        <w:sz w:val="24"/>
+        <w:szCs w:val="24"/>
+      </w:rPr>
       <w:t>La ciencia y la tecnología al servicio de la liberación permanente de la humanización del hombre</w:t>
+    </w:r>
+    <w:r>
+      <w:rPr>
+        <w:rFonts w:eastAsia="Times New Roman" w:cs="Times New Roman"/>
+        <w:b/>
+        <w:color w:val="C80000"/>
+        <w:sz w:val="24"/>
+        <w:szCs w:val="24"/>
+      </w:rPr>
+      <w:t>”</w:t>
     </w:r>
     <w:r>
       <w:rPr>

</xml_diff>